<commit_message>
Math T5 : calculs verticaux et visuels guidés dans les corrigés
- Ajout de schémas SVG pour additions, soustractions, multiplications, divisions, fractions, décimaux et conversions\n- Les 20 sujets d'opérations montrent maintenant les calculs verticalement avec flèches et abaissements\n- Exemple 693 x 94 visualisé avec produits partiels, décalage des dizaines et contrôle par 9\n- Renforcement des visuels multiplication et preuve par 9 dans l'unité II et les Méthodes d'or\n- Audit visuel complet conservé dans AUDIT_VISUELS_MATH_T5.md

Co-authored-by: arena-agent <297053741+arena-agent@users.noreply.github.com>
</commit_message>
<xml_diff>
--- a/manuel-math-t5/Manuel_Mathematiques_T5_METHODES.docx
+++ b/manuel-math-t5/Manuel_Mathematiques_T5_METHODES.docx
@@ -1132,7 +1132,7 @@
       <w:r>
         <w:drawing>
           <wp:inline distT="0" distB="0" distL="0" distR="0">
-            <wp:extent cx="4762500" cy="3086100"/>
+            <wp:extent cx="4762500" cy="4876800"/>
             <wp:effectExtent t="0" r="0" b="0" l="0"/>
             <wp:docPr id="3" name=""/>
             <wp:cNvGraphicFramePr>
@@ -1157,7 +1157,7 @@
                   <pic:spPr bwMode="auto">
                     <a:xfrm>
                       <a:off x="0" y="0"/>
-                      <a:ext cx="4762500" cy="3086100"/>
+                      <a:ext cx="4762500" cy="4876800"/>
                     </a:xfrm>
                     <a:prstGeom prst="rect">
                       <a:avLst/>

</xml_diff>